<commit_message>
CU corregidos, se incorpora auxiliar
</commit_message>
<xml_diff>
--- a/CU/CU-01.docx
+++ b/CU/CU-01.docx
@@ -1636,7 +1636,6 @@
               <w:rPr>
                 <w:sz w:val="22"/>
                 <w:szCs w:val="22"/>
-                <w:u w:val="single"/>
               </w:rPr>
               <w:t>máximo</w:t>
             </w:r>
@@ -1652,7 +1651,21 @@
                 <w:sz w:val="22"/>
                 <w:szCs w:val="22"/>
               </w:rPr>
-              <w:t>2 segundos.</w:t>
+              <w:t xml:space="preserve">2 </w:t>
+            </w:r>
+            <w:r>
+              <w:rPr>
+                <w:sz w:val="22"/>
+                <w:szCs w:val="22"/>
+              </w:rPr>
+              <w:t>minutos</w:t>
+            </w:r>
+            <w:r>
+              <w:rPr>
+                <w:sz w:val="22"/>
+                <w:szCs w:val="22"/>
+              </w:rPr>
+              <w:t>.</w:t>
             </w:r>
           </w:p>
         </w:tc>

</xml_diff>